<commit_message>
Cahiers de test : connexion par l'adresse de chaque application, rayons et tuiles de l'accueil
L'adresse de la recette ouvre la connexion à Finance : les comptes sans Finance (cabinet, RH,
salarié, porteur) se connectent par /axispro, /rh, /analyse ou /portail ; l'accueil présente des
rayons de tuiles, et non une tuile par application.

Co-Authored-By: Claude Opus 5.5 <noreply@anthropic.com>
</commit_message>
<xml_diff>
--- a/docs/projet/tests-utilisateurs/word/Cahier_de_test_01_Socle_commun.docx
+++ b/docs/projet/tests-utilisateurs/word/Cahier_de_test_01_Socle_commun.docx
@@ -787,7 +787,7 @@
           <w:sz w:val="20"/>
           <w:szCs w:val="20"/>
         </w:rPr>
-        <w:t xml:space="preserve">Se connecter. Ouvrez l'adresse de la recette communiquée par E-VOLUTION XP, dans Chrome ou Edge. Identifiant : le compte de test indiqué dans le scénario. Mot de passe : le mot de passe commun de la recette, communiqué par E-VOLUTION XP. La double authentification est suspendue sur la recette pendant les tests, sauf mention contraire.</w:t>
+        <w:t xml:space="preserve">Se connecter. Ouvrez l'adresse de la recette communiquée par E-VOLUTION XP, dans Chrome ou Edge. Identifiant : le compte de test indiqué dans le scénario. Mot de passe : le mot de passe commun de la recette, communiqué par E-VOLUTION XP. La double authentification est suspendue sur la recette pendant les tests, sauf mention contraire. L'adresse de la recette ouvre la connexion à Finance : un compte sans Finance (cabinet, RH, salarié, porteur) se connecte par l'adresse de la recette suivie de /axispro, /rh ou /portail.</w:t>
       </w:r>
     </w:p>
     <w:p>
@@ -2466,7 +2466,7 @@
           <w:sz w:val="20"/>
           <w:szCs w:val="20"/>
         </w:rPr>
-        <w:t xml:space="preserve">Cliquez sur la tuile Finance, puis sur le rond à vos initiales, en haut à droite.</w:t>
+        <w:t xml:space="preserve">Dans le rayon Finance de l'accueil, cliquez sur la tuile « Tableau de bord », puis sur le rond à vos initiales, en haut à droite.</w:t>
       </w:r>
     </w:p>
     <w:p>
@@ -2480,7 +2480,7 @@
           <w:sz w:val="20"/>
           <w:szCs w:val="20"/>
         </w:rPr>
-        <w:t xml:space="preserve">Résultat attendu : l'accueil NIMOVA s'ouvre sur les tuiles des applications du compte (Finance, Transport, Analyse). Dans Finance, le menu du compte affiche « Test - Comptable » et « test.comptable », puis « Changer le mot de passe », « Mes demandes », les autres applications du compte et « Se déconnecter ».</w:t>
+        <w:t xml:space="preserve">Résultat attendu : l'accueil NIMOVA s'ouvre sur les rayons des applications du compte (Finance, Transport, Analyse), chacun avec ses tuiles. Dans Finance, le menu du compte affiche « Test - Comptable » et « test.comptable », puis « Changer le mot de passe », « Mes demandes », les autres applications du compte et « Se déconnecter ».</w:t>
       </w:r>
     </w:p>
     <w:tbl>
@@ -3121,7 +3121,7 @@
           <w:sz w:val="20"/>
           <w:szCs w:val="20"/>
         </w:rPr>
-        <w:t xml:space="preserve">Données : un mot de passe faux, puis le bon.</w:t>
+        <w:t xml:space="preserve">Données : un mot de passe faux, puis le bon ; l'adresse de la recette suivie de /rh (test.salarie n'a que « Mon espace »).</w:t>
       </w:r>
     </w:p>
     <w:p>
@@ -13125,7 +13125,7 @@
           <w:sz w:val="20"/>
           <w:szCs w:val="20"/>
         </w:rPr>
-        <w:t xml:space="preserve">Connectez-vous : l'accueil ne montre pas de tuile Finance.</w:t>
+        <w:t xml:space="preserve">Ouvrez l'adresse de la recette (connexion à Finance) et connectez-vous avec test.consultant.</w:t>
       </w:r>
     </w:p>
     <w:p>
@@ -13154,7 +13154,7 @@
           <w:sz w:val="20"/>
           <w:szCs w:val="20"/>
         </w:rPr>
-        <w:t xml:space="preserve">Dans la barre d'adresse du navigateur, remplacez la fin de l'adresse par /finance et validez.</w:t>
+        <w:t xml:space="preserve">Ouvrez l'adresse de la recette suivie de /axispro et connectez-vous : l'accueil ne montre pas de rayon Finance.</w:t>
       </w:r>
     </w:p>
     <w:p>
@@ -13183,6 +13183,35 @@
           <w:sz w:val="20"/>
           <w:szCs w:val="20"/>
         </w:rPr>
+        <w:t xml:space="preserve">Dans la barre d'adresse du navigateur, remplacez la fin de l'adresse par /finance et validez.</w:t>
+      </w:r>
+    </w:p>
+    <w:p>
+      <w:pPr>
+        <w:tabs>
+          <w:tab w:val="left" w:pos="360"/>
+        </w:tabs>
+        <w:spacing w:after="60"/>
+        <w:ind w:left="360" w:hanging="360"/>
+        <w:jc w:val="both"/>
+      </w:pPr>
+      <w:r>
+        <w:rPr>
+          <w:rFonts w:ascii="Calibri" w:cs="Calibri" w:eastAsia="Calibri" w:hAnsi="Calibri"/>
+          <w:b/>
+          <w:bCs/>
+          <w:color w:val="1A9E9E"/>
+          <w:sz w:val="20"/>
+          <w:szCs w:val="20"/>
+        </w:rPr>
+        <w:t xml:space="preserve">4.	</w:t>
+      </w:r>
+      <w:r>
+        <w:rPr>
+          <w:rFonts w:ascii="Calibri" w:cs="Calibri" w:eastAsia="Calibri" w:hAnsi="Calibri"/>
+          <w:sz w:val="20"/>
+          <w:szCs w:val="20"/>
+        </w:rPr>
         <w:t xml:space="preserve">Cliquez sur le bouton proposé.</w:t>
       </w:r>
     </w:p>
@@ -13197,7 +13226,7 @@
           <w:sz w:val="20"/>
           <w:szCs w:val="20"/>
         </w:rPr>
-        <w:t xml:space="preserve">Résultat attendu : la page « Accès non ouvert à votre profil » s'affiche : « Votre profil ne donne pas accès à NIMOVA · Finance. Si votre travail le demande, l'administrateur de la plateforme peut vous ouvrir ce profil. ». Aucun chiffre de Finance n'est montré. Le bouton « Aller à MB AxisPro Consulting » ouvre AxisPro.</w:t>
+        <w:t xml:space="preserve">Résultat attendu : à l'étape 1, « Votre profil ne donne pas accès à cette application. ». À l'étape 3, la page « Accès non ouvert à votre profil » s'affiche : « Votre profil ne donne pas accès à NIMOVA · Finance. Si votre travail le demande, l'administrateur de la plateforme peut vous ouvrir ce profil. ». Aucun chiffre de Finance n'est montré. Le bouton « Aller à MB AxisPro Consulting » ouvre AxisPro.</w:t>
       </w:r>
     </w:p>
     <w:tbl>
@@ -14209,7 +14238,7 @@
           <w:sz w:val="20"/>
           <w:szCs w:val="20"/>
         </w:rPr>
-        <w:t xml:space="preserve">test.salarie : connectez-vous. Regardez la barre du haut de « Mon espace ».</w:t>
+        <w:t xml:space="preserve">test.salarie : ouvrez l'adresse de la recette suivie de /rh et connectez-vous. Regardez la barre du haut de « Mon espace ».</w:t>
       </w:r>
     </w:p>
     <w:p>
@@ -14238,7 +14267,7 @@
           <w:sz w:val="20"/>
           <w:szCs w:val="20"/>
         </w:rPr>
-        <w:t xml:space="preserve">test.porteur : connectez-vous au portail. Ouvrez le menu de votre compte.</w:t>
+        <w:t xml:space="preserve">test.porteur : ouvrez l'adresse de la recette suivie de /portail et connectez-vous. Ouvrez le menu de votre compte.</w:t>
       </w:r>
     </w:p>
     <w:p>

</xml_diff>

<commit_message>
Cahier de test du socle : adresse de connexion de chaque application, discussion relue sur le code fusionné (34 scénarios)
Tableau des adresses par application dans le mode d'emploi ; réponse et retrait sous chaque message,
cinq pièces jointes au plus, membres d'un groupe (« Ajouter des membres »), lien « Fiche » ; retrait
d'un compte désactivé de ses discussions par l'administration.

Co-Authored-By: Claude Opus 5.5 <noreply@anthropic.com>
</commit_message>
<xml_diff>
--- a/docs/projet/tests-utilisateurs/word/Cahier_de_test_01_Socle_commun.docx
+++ b/docs/projet/tests-utilisateurs/word/Cahier_de_test_01_Socle_commun.docx
@@ -787,7 +787,7 @@
           <w:sz w:val="20"/>
           <w:szCs w:val="20"/>
         </w:rPr>
-        <w:t xml:space="preserve">Se connecter. Ouvrez l'adresse de la recette communiquée par E-VOLUTION XP, dans Chrome ou Edge. Identifiant : le compte de test indiqué dans le scénario. Mot de passe : le mot de passe commun de la recette, communiqué par E-VOLUTION XP. La double authentification est suspendue sur la recette pendant les tests, sauf mention contraire. L'adresse de la recette ouvre la connexion à Finance : un compte sans Finance (cabinet, RH, salarié, porteur) se connecte par l'adresse de la recette suivie de /axispro, /rh ou /portail.</w:t>
+        <w:t xml:space="preserve">Se connecter. Ouvrez l'adresse de votre application (tableau ci-dessous), dans Chrome ou Edge. Identifiant : le compte de test indiqué dans le scénario. Mot de passe : le mot de passe commun de la recette, communiqué par E-VOLUTION XP. La double authentification est suspendue sur la recette pendant les tests, sauf mention contraire.</w:t>
       </w:r>
     </w:p>
     <w:p>
@@ -905,6 +905,732 @@
         </w:rPr>
         <w:t xml:space="preserve">Ne saisissez aucune information réelle confidentielle : ni compte bancaire, ni salaire, ni mot de passe dans une demande ou un message.</w:t>
       </w:r>
+    </w:p>
+    <w:p>
+      <w:pPr>
+        <w:spacing w:after="100"/>
+        <w:jc w:val="both"/>
+      </w:pPr>
+      <w:r>
+        <w:rPr>
+          <w:rFonts w:ascii="Calibri" w:cs="Calibri" w:eastAsia="Calibri" w:hAnsi="Calibri"/>
+          <w:sz w:val="20"/>
+          <w:szCs w:val="20"/>
+        </w:rPr>
+        <w:t xml:space="preserve">La connexion se fait toujours dans une application : celle de l'adresse ouverte. L'adresse de la recette, seule, ouvre la connexion à Finance, puis l'accueil NIMOVA, d'où l'on passe aux autres applications du compte. Un compte qui n'a pas Finance doit ouvrir l'adresse de son application ; sinon la connexion répond « Votre profil ne donne pas accès à cette application. ».</w:t>
+      </w:r>
+    </w:p>
+    <w:tbl>
+      <w:tblPr>
+        <w:tblW w:type="dxa" w:w="9638"/>
+        <w:tblBorders>
+          <w:top w:val="single" w:color="auto" w:sz="4"/>
+          <w:left w:val="single" w:color="auto" w:sz="4"/>
+          <w:bottom w:val="single" w:color="auto" w:sz="4"/>
+          <w:right w:val="single" w:color="auto" w:sz="4"/>
+          <w:insideH w:val="single" w:color="auto" w:sz="4"/>
+          <w:insideV w:val="single" w:color="auto" w:sz="4"/>
+        </w:tblBorders>
+      </w:tblPr>
+      <w:tblGrid>
+        <w:gridCol w:w="2891"/>
+        <w:gridCol w:w="3277"/>
+        <w:gridCol w:w="3470"/>
+      </w:tblGrid>
+      <w:tr>
+        <w:trPr>
+          <w:tblHeader/>
+        </w:trPr>
+        <w:tc>
+          <w:tcPr>
+            <w:tcW w:type="dxa" w:w="2891"/>
+            <w:tcBorders>
+              <w:top w:val="single" w:color="C9CFD8" w:sz="4"/>
+              <w:left w:val="single" w:color="C9CFD8" w:sz="4"/>
+              <w:bottom w:val="single" w:color="C9CFD8" w:sz="4"/>
+              <w:right w:val="single" w:color="C9CFD8" w:sz="4"/>
+            </w:tcBorders>
+            <w:shd w:fill="1C1E6B" w:color="auto" w:val="clear"/>
+            <w:tcMar>
+              <w:top w:type="dxa" w:w="50"/>
+              <w:left w:type="dxa" w:w="90"/>
+              <w:bottom w:type="dxa" w:w="50"/>
+              <w:right w:type="dxa" w:w="90"/>
+            </w:tcMar>
+            <w:vAlign w:val="center"/>
+          </w:tcPr>
+          <w:p>
+            <w:pPr>
+              <w:spacing w:after="0"/>
+            </w:pPr>
+            <w:r>
+              <w:rPr>
+                <w:rFonts w:ascii="Calibri" w:cs="Calibri" w:eastAsia="Calibri" w:hAnsi="Calibri"/>
+                <w:b/>
+                <w:bCs/>
+                <w:color w:val="FFFFFF"/>
+                <w:sz w:val="17"/>
+                <w:szCs w:val="17"/>
+              </w:rPr>
+              <w:t xml:space="preserve">Application</w:t>
+            </w:r>
+          </w:p>
+        </w:tc>
+        <w:tc>
+          <w:tcPr>
+            <w:tcW w:type="dxa" w:w="3277"/>
+            <w:tcBorders>
+              <w:top w:val="single" w:color="C9CFD8" w:sz="4"/>
+              <w:left w:val="single" w:color="C9CFD8" w:sz="4"/>
+              <w:bottom w:val="single" w:color="C9CFD8" w:sz="4"/>
+              <w:right w:val="single" w:color="C9CFD8" w:sz="4"/>
+            </w:tcBorders>
+            <w:shd w:fill="1C1E6B" w:color="auto" w:val="clear"/>
+            <w:tcMar>
+              <w:top w:type="dxa" w:w="50"/>
+              <w:left w:type="dxa" w:w="90"/>
+              <w:bottom w:type="dxa" w:w="50"/>
+              <w:right w:type="dxa" w:w="90"/>
+            </w:tcMar>
+            <w:vAlign w:val="center"/>
+          </w:tcPr>
+          <w:p>
+            <w:pPr>
+              <w:spacing w:after="0"/>
+            </w:pPr>
+            <w:r>
+              <w:rPr>
+                <w:rFonts w:ascii="Calibri" w:cs="Calibri" w:eastAsia="Calibri" w:hAnsi="Calibri"/>
+                <w:b/>
+                <w:bCs/>
+                <w:color w:val="FFFFFF"/>
+                <w:sz w:val="17"/>
+                <w:szCs w:val="17"/>
+              </w:rPr>
+              <w:t xml:space="preserve">Adresse à ouvrir</w:t>
+            </w:r>
+          </w:p>
+        </w:tc>
+        <w:tc>
+          <w:tcPr>
+            <w:tcW w:type="dxa" w:w="3470"/>
+            <w:tcBorders>
+              <w:top w:val="single" w:color="C9CFD8" w:sz="4"/>
+              <w:left w:val="single" w:color="C9CFD8" w:sz="4"/>
+              <w:bottom w:val="single" w:color="C9CFD8" w:sz="4"/>
+              <w:right w:val="single" w:color="C9CFD8" w:sz="4"/>
+            </w:tcBorders>
+            <w:shd w:fill="1C1E6B" w:color="auto" w:val="clear"/>
+            <w:tcMar>
+              <w:top w:type="dxa" w:w="50"/>
+              <w:left w:type="dxa" w:w="90"/>
+              <w:bottom w:type="dxa" w:w="50"/>
+              <w:right w:type="dxa" w:w="90"/>
+            </w:tcMar>
+            <w:vAlign w:val="center"/>
+          </w:tcPr>
+          <w:p>
+            <w:pPr>
+              <w:spacing w:after="0"/>
+            </w:pPr>
+            <w:r>
+              <w:rPr>
+                <w:rFonts w:ascii="Calibri" w:cs="Calibri" w:eastAsia="Calibri" w:hAnsi="Calibri"/>
+                <w:b/>
+                <w:bCs/>
+                <w:color w:val="FFFFFF"/>
+                <w:sz w:val="17"/>
+                <w:szCs w:val="17"/>
+              </w:rPr>
+              <w:t xml:space="preserve">Comptes de test</w:t>
+            </w:r>
+          </w:p>
+        </w:tc>
+      </w:tr>
+      <w:tr>
+        <w:tc>
+          <w:tcPr>
+            <w:tcW w:type="dxa" w:w="2891"/>
+            <w:tcBorders>
+              <w:top w:val="single" w:color="C9CFD8" w:sz="4"/>
+              <w:left w:val="single" w:color="C9CFD8" w:sz="4"/>
+              <w:bottom w:val="single" w:color="C9CFD8" w:sz="4"/>
+              <w:right w:val="single" w:color="C9CFD8" w:sz="4"/>
+            </w:tcBorders>
+            <w:tcMar>
+              <w:top w:type="dxa" w:w="50"/>
+              <w:left w:type="dxa" w:w="90"/>
+              <w:bottom w:type="dxa" w:w="50"/>
+              <w:right w:type="dxa" w:w="90"/>
+            </w:tcMar>
+            <w:vAlign w:val="center"/>
+          </w:tcPr>
+          <w:p>
+            <w:pPr>
+              <w:spacing w:after="0"/>
+            </w:pPr>
+            <w:r>
+              <w:rPr>
+                <w:rFonts w:ascii="Calibri" w:cs="Calibri" w:eastAsia="Calibri" w:hAnsi="Calibri"/>
+                <w:sz w:val="17"/>
+                <w:szCs w:val="17"/>
+              </w:rPr>
+              <w:t xml:space="preserve">Finance, Transport, Analyse, RH (par l'accueil NIMOVA)</w:t>
+            </w:r>
+          </w:p>
+        </w:tc>
+        <w:tc>
+          <w:tcPr>
+            <w:tcW w:type="dxa" w:w="3277"/>
+            <w:tcBorders>
+              <w:top w:val="single" w:color="C9CFD8" w:sz="4"/>
+              <w:left w:val="single" w:color="C9CFD8" w:sz="4"/>
+              <w:bottom w:val="single" w:color="C9CFD8" w:sz="4"/>
+              <w:right w:val="single" w:color="C9CFD8" w:sz="4"/>
+            </w:tcBorders>
+            <w:tcMar>
+              <w:top w:type="dxa" w:w="50"/>
+              <w:left w:type="dxa" w:w="90"/>
+              <w:bottom w:type="dxa" w:w="50"/>
+              <w:right w:type="dxa" w:w="90"/>
+            </w:tcMar>
+            <w:vAlign w:val="center"/>
+          </w:tcPr>
+          <w:p>
+            <w:pPr>
+              <w:spacing w:after="0"/>
+            </w:pPr>
+            <w:r>
+              <w:rPr>
+                <w:rFonts w:ascii="Calibri" w:cs="Calibri" w:eastAsia="Calibri" w:hAnsi="Calibri"/>
+                <w:sz w:val="17"/>
+                <w:szCs w:val="17"/>
+              </w:rPr>
+              <w:t xml:space="preserve">l'adresse de la recette</w:t>
+            </w:r>
+          </w:p>
+        </w:tc>
+        <w:tc>
+          <w:tcPr>
+            <w:tcW w:type="dxa" w:w="3470"/>
+            <w:tcBorders>
+              <w:top w:val="single" w:color="C9CFD8" w:sz="4"/>
+              <w:left w:val="single" w:color="C9CFD8" w:sz="4"/>
+              <w:bottom w:val="single" w:color="C9CFD8" w:sz="4"/>
+              <w:right w:val="single" w:color="C9CFD8" w:sz="4"/>
+            </w:tcBorders>
+            <w:tcMar>
+              <w:top w:type="dxa" w:w="50"/>
+              <w:left w:type="dxa" w:w="90"/>
+              <w:bottom w:type="dxa" w:w="50"/>
+              <w:right w:type="dxa" w:w="90"/>
+            </w:tcMar>
+            <w:vAlign w:val="center"/>
+          </w:tcPr>
+          <w:p>
+            <w:pPr>
+              <w:spacing w:after="0"/>
+            </w:pPr>
+            <w:r>
+              <w:rPr>
+                <w:rFonts w:ascii="Calibri" w:cs="Calibri" w:eastAsia="Calibri" w:hAnsi="Calibri"/>
+                <w:sz w:val="17"/>
+                <w:szCs w:val="17"/>
+              </w:rPr>
+              <w:t xml:space="preserve">test.dg, test.daf, test.comptable, test.achats, test.exploitation, test.parc, test.chantiers, test.immobilier, test.admin</w:t>
+            </w:r>
+          </w:p>
+        </w:tc>
+      </w:tr>
+      <w:tr>
+        <w:tc>
+          <w:tcPr>
+            <w:tcW w:type="dxa" w:w="2891"/>
+            <w:tcBorders>
+              <w:top w:val="single" w:color="C9CFD8" w:sz="4"/>
+              <w:left w:val="single" w:color="C9CFD8" w:sz="4"/>
+              <w:bottom w:val="single" w:color="C9CFD8" w:sz="4"/>
+              <w:right w:val="single" w:color="C9CFD8" w:sz="4"/>
+            </w:tcBorders>
+            <w:shd w:fill="F2F4F7" w:color="auto" w:val="clear"/>
+            <w:tcMar>
+              <w:top w:type="dxa" w:w="50"/>
+              <w:left w:type="dxa" w:w="90"/>
+              <w:bottom w:type="dxa" w:w="50"/>
+              <w:right w:type="dxa" w:w="90"/>
+            </w:tcMar>
+            <w:vAlign w:val="center"/>
+          </w:tcPr>
+          <w:p>
+            <w:pPr>
+              <w:spacing w:after="0"/>
+            </w:pPr>
+            <w:r>
+              <w:rPr>
+                <w:rFonts w:ascii="Calibri" w:cs="Calibri" w:eastAsia="Calibri" w:hAnsi="Calibri"/>
+                <w:sz w:val="17"/>
+                <w:szCs w:val="17"/>
+              </w:rPr>
+              <w:t xml:space="preserve">MB AxisPro Consulting (AxisPro Suite)</w:t>
+            </w:r>
+          </w:p>
+        </w:tc>
+        <w:tc>
+          <w:tcPr>
+            <w:tcW w:type="dxa" w:w="3277"/>
+            <w:tcBorders>
+              <w:top w:val="single" w:color="C9CFD8" w:sz="4"/>
+              <w:left w:val="single" w:color="C9CFD8" w:sz="4"/>
+              <w:bottom w:val="single" w:color="C9CFD8" w:sz="4"/>
+              <w:right w:val="single" w:color="C9CFD8" w:sz="4"/>
+            </w:tcBorders>
+            <w:shd w:fill="F2F4F7" w:color="auto" w:val="clear"/>
+            <w:tcMar>
+              <w:top w:type="dxa" w:w="50"/>
+              <w:left w:type="dxa" w:w="90"/>
+              <w:bottom w:type="dxa" w:w="50"/>
+              <w:right w:type="dxa" w:w="90"/>
+            </w:tcMar>
+            <w:vAlign w:val="center"/>
+          </w:tcPr>
+          <w:p>
+            <w:pPr>
+              <w:spacing w:after="0"/>
+            </w:pPr>
+            <w:r>
+              <w:rPr>
+                <w:rFonts w:ascii="Calibri" w:cs="Calibri" w:eastAsia="Calibri" w:hAnsi="Calibri"/>
+                <w:sz w:val="17"/>
+                <w:szCs w:val="17"/>
+              </w:rPr>
+              <w:t xml:space="preserve">l'adresse de la recette suivie de /axispro</w:t>
+            </w:r>
+          </w:p>
+        </w:tc>
+        <w:tc>
+          <w:tcPr>
+            <w:tcW w:type="dxa" w:w="3470"/>
+            <w:tcBorders>
+              <w:top w:val="single" w:color="C9CFD8" w:sz="4"/>
+              <w:left w:val="single" w:color="C9CFD8" w:sz="4"/>
+              <w:bottom w:val="single" w:color="C9CFD8" w:sz="4"/>
+              <w:right w:val="single" w:color="C9CFD8" w:sz="4"/>
+            </w:tcBorders>
+            <w:shd w:fill="F2F4F7" w:color="auto" w:val="clear"/>
+            <w:tcMar>
+              <w:top w:type="dxa" w:w="50"/>
+              <w:left w:type="dxa" w:w="90"/>
+              <w:bottom w:type="dxa" w:w="50"/>
+              <w:right w:type="dxa" w:w="90"/>
+            </w:tcMar>
+            <w:vAlign w:val="center"/>
+          </w:tcPr>
+          <w:p>
+            <w:pPr>
+              <w:spacing w:after="0"/>
+            </w:pPr>
+            <w:r>
+              <w:rPr>
+                <w:rFonts w:ascii="Calibri" w:cs="Calibri" w:eastAsia="Calibri" w:hAnsi="Calibri"/>
+                <w:sz w:val="17"/>
+                <w:szCs w:val="17"/>
+              </w:rPr>
+              <w:t xml:space="preserve">test.consultant, test.associe</w:t>
+            </w:r>
+          </w:p>
+        </w:tc>
+      </w:tr>
+      <w:tr>
+        <w:tc>
+          <w:tcPr>
+            <w:tcW w:type="dxa" w:w="2891"/>
+            <w:tcBorders>
+              <w:top w:val="single" w:color="C9CFD8" w:sz="4"/>
+              <w:left w:val="single" w:color="C9CFD8" w:sz="4"/>
+              <w:bottom w:val="single" w:color="C9CFD8" w:sz="4"/>
+              <w:right w:val="single" w:color="C9CFD8" w:sz="4"/>
+            </w:tcBorders>
+            <w:tcMar>
+              <w:top w:type="dxa" w:w="50"/>
+              <w:left w:type="dxa" w:w="90"/>
+              <w:bottom w:type="dxa" w:w="50"/>
+              <w:right w:type="dxa" w:w="90"/>
+            </w:tcMar>
+            <w:vAlign w:val="center"/>
+          </w:tcPr>
+          <w:p>
+            <w:pPr>
+              <w:spacing w:after="0"/>
+            </w:pPr>
+            <w:r>
+              <w:rPr>
+                <w:rFonts w:ascii="Calibri" w:cs="Calibri" w:eastAsia="Calibri" w:hAnsi="Calibri"/>
+                <w:sz w:val="17"/>
+                <w:szCs w:val="17"/>
+              </w:rPr>
+              <w:t xml:space="preserve">Analyse, pour le cabinet</w:t>
+            </w:r>
+          </w:p>
+        </w:tc>
+        <w:tc>
+          <w:tcPr>
+            <w:tcW w:type="dxa" w:w="3277"/>
+            <w:tcBorders>
+              <w:top w:val="single" w:color="C9CFD8" w:sz="4"/>
+              <w:left w:val="single" w:color="C9CFD8" w:sz="4"/>
+              <w:bottom w:val="single" w:color="C9CFD8" w:sz="4"/>
+              <w:right w:val="single" w:color="C9CFD8" w:sz="4"/>
+            </w:tcBorders>
+            <w:tcMar>
+              <w:top w:type="dxa" w:w="50"/>
+              <w:left w:type="dxa" w:w="90"/>
+              <w:bottom w:type="dxa" w:w="50"/>
+              <w:right w:type="dxa" w:w="90"/>
+            </w:tcMar>
+            <w:vAlign w:val="center"/>
+          </w:tcPr>
+          <w:p>
+            <w:pPr>
+              <w:spacing w:after="0"/>
+            </w:pPr>
+            <w:r>
+              <w:rPr>
+                <w:rFonts w:ascii="Calibri" w:cs="Calibri" w:eastAsia="Calibri" w:hAnsi="Calibri"/>
+                <w:sz w:val="17"/>
+                <w:szCs w:val="17"/>
+              </w:rPr>
+              <w:t xml:space="preserve">l'adresse de la recette suivie de /analyse</w:t>
+            </w:r>
+          </w:p>
+        </w:tc>
+        <w:tc>
+          <w:tcPr>
+            <w:tcW w:type="dxa" w:w="3470"/>
+            <w:tcBorders>
+              <w:top w:val="single" w:color="C9CFD8" w:sz="4"/>
+              <w:left w:val="single" w:color="C9CFD8" w:sz="4"/>
+              <w:bottom w:val="single" w:color="C9CFD8" w:sz="4"/>
+              <w:right w:val="single" w:color="C9CFD8" w:sz="4"/>
+            </w:tcBorders>
+            <w:tcMar>
+              <w:top w:type="dxa" w:w="50"/>
+              <w:left w:type="dxa" w:w="90"/>
+              <w:bottom w:type="dxa" w:w="50"/>
+              <w:right w:type="dxa" w:w="90"/>
+            </w:tcMar>
+            <w:vAlign w:val="center"/>
+          </w:tcPr>
+          <w:p>
+            <w:pPr>
+              <w:spacing w:after="0"/>
+            </w:pPr>
+            <w:r>
+              <w:rPr>
+                <w:rFonts w:ascii="Calibri" w:cs="Calibri" w:eastAsia="Calibri" w:hAnsi="Calibri"/>
+                <w:sz w:val="17"/>
+                <w:szCs w:val="17"/>
+              </w:rPr>
+              <w:t xml:space="preserve">test.consultant, test.associe</w:t>
+            </w:r>
+          </w:p>
+        </w:tc>
+      </w:tr>
+      <w:tr>
+        <w:tc>
+          <w:tcPr>
+            <w:tcW w:type="dxa" w:w="2891"/>
+            <w:tcBorders>
+              <w:top w:val="single" w:color="C9CFD8" w:sz="4"/>
+              <w:left w:val="single" w:color="C9CFD8" w:sz="4"/>
+              <w:bottom w:val="single" w:color="C9CFD8" w:sz="4"/>
+              <w:right w:val="single" w:color="C9CFD8" w:sz="4"/>
+            </w:tcBorders>
+            <w:shd w:fill="F2F4F7" w:color="auto" w:val="clear"/>
+            <w:tcMar>
+              <w:top w:type="dxa" w:w="50"/>
+              <w:left w:type="dxa" w:w="90"/>
+              <w:bottom w:type="dxa" w:w="50"/>
+              <w:right w:type="dxa" w:w="90"/>
+            </w:tcMar>
+            <w:vAlign w:val="center"/>
+          </w:tcPr>
+          <w:p>
+            <w:pPr>
+              <w:spacing w:after="0"/>
+            </w:pPr>
+            <w:r>
+              <w:rPr>
+                <w:rFonts w:ascii="Calibri" w:cs="Calibri" w:eastAsia="Calibri" w:hAnsi="Calibri"/>
+                <w:sz w:val="17"/>
+                <w:szCs w:val="17"/>
+              </w:rPr>
+              <w:t xml:space="preserve">RH et « Mon espace »</w:t>
+            </w:r>
+          </w:p>
+        </w:tc>
+        <w:tc>
+          <w:tcPr>
+            <w:tcW w:type="dxa" w:w="3277"/>
+            <w:tcBorders>
+              <w:top w:val="single" w:color="C9CFD8" w:sz="4"/>
+              <w:left w:val="single" w:color="C9CFD8" w:sz="4"/>
+              <w:bottom w:val="single" w:color="C9CFD8" w:sz="4"/>
+              <w:right w:val="single" w:color="C9CFD8" w:sz="4"/>
+            </w:tcBorders>
+            <w:shd w:fill="F2F4F7" w:color="auto" w:val="clear"/>
+            <w:tcMar>
+              <w:top w:type="dxa" w:w="50"/>
+              <w:left w:type="dxa" w:w="90"/>
+              <w:bottom w:type="dxa" w:w="50"/>
+              <w:right w:type="dxa" w:w="90"/>
+            </w:tcMar>
+            <w:vAlign w:val="center"/>
+          </w:tcPr>
+          <w:p>
+            <w:pPr>
+              <w:spacing w:after="0"/>
+            </w:pPr>
+            <w:r>
+              <w:rPr>
+                <w:rFonts w:ascii="Calibri" w:cs="Calibri" w:eastAsia="Calibri" w:hAnsi="Calibri"/>
+                <w:sz w:val="17"/>
+                <w:szCs w:val="17"/>
+              </w:rPr>
+              <w:t xml:space="preserve">l'adresse de la recette suivie de /rh</w:t>
+            </w:r>
+          </w:p>
+        </w:tc>
+        <w:tc>
+          <w:tcPr>
+            <w:tcW w:type="dxa" w:w="3470"/>
+            <w:tcBorders>
+              <w:top w:val="single" w:color="C9CFD8" w:sz="4"/>
+              <w:left w:val="single" w:color="C9CFD8" w:sz="4"/>
+              <w:bottom w:val="single" w:color="C9CFD8" w:sz="4"/>
+              <w:right w:val="single" w:color="C9CFD8" w:sz="4"/>
+            </w:tcBorders>
+            <w:shd w:fill="F2F4F7" w:color="auto" w:val="clear"/>
+            <w:tcMar>
+              <w:top w:type="dxa" w:w="50"/>
+              <w:left w:type="dxa" w:w="90"/>
+              <w:bottom w:type="dxa" w:w="50"/>
+              <w:right w:type="dxa" w:w="90"/>
+            </w:tcMar>
+            <w:vAlign w:val="center"/>
+          </w:tcPr>
+          <w:p>
+            <w:pPr>
+              <w:spacing w:after="0"/>
+            </w:pPr>
+            <w:r>
+              <w:rPr>
+                <w:rFonts w:ascii="Calibri" w:cs="Calibri" w:eastAsia="Calibri" w:hAnsi="Calibri"/>
+                <w:sz w:val="17"/>
+                <w:szCs w:val="17"/>
+              </w:rPr>
+              <w:t xml:space="preserve">test.rh, test.salarie</w:t>
+            </w:r>
+          </w:p>
+        </w:tc>
+      </w:tr>
+      <w:tr>
+        <w:tc>
+          <w:tcPr>
+            <w:tcW w:type="dxa" w:w="2891"/>
+            <w:tcBorders>
+              <w:top w:val="single" w:color="C9CFD8" w:sz="4"/>
+              <w:left w:val="single" w:color="C9CFD8" w:sz="4"/>
+              <w:bottom w:val="single" w:color="C9CFD8" w:sz="4"/>
+              <w:right w:val="single" w:color="C9CFD8" w:sz="4"/>
+            </w:tcBorders>
+            <w:tcMar>
+              <w:top w:type="dxa" w:w="50"/>
+              <w:left w:type="dxa" w:w="90"/>
+              <w:bottom w:type="dxa" w:w="50"/>
+              <w:right w:type="dxa" w:w="90"/>
+            </w:tcMar>
+            <w:vAlign w:val="center"/>
+          </w:tcPr>
+          <w:p>
+            <w:pPr>
+              <w:spacing w:after="0"/>
+            </w:pPr>
+            <w:r>
+              <w:rPr>
+                <w:rFonts w:ascii="Calibri" w:cs="Calibri" w:eastAsia="Calibri" w:hAnsi="Calibri"/>
+                <w:sz w:val="17"/>
+                <w:szCs w:val="17"/>
+              </w:rPr>
+              <w:t xml:space="preserve">Rotations, au téléphone</w:t>
+            </w:r>
+          </w:p>
+        </w:tc>
+        <w:tc>
+          <w:tcPr>
+            <w:tcW w:type="dxa" w:w="3277"/>
+            <w:tcBorders>
+              <w:top w:val="single" w:color="C9CFD8" w:sz="4"/>
+              <w:left w:val="single" w:color="C9CFD8" w:sz="4"/>
+              <w:bottom w:val="single" w:color="C9CFD8" w:sz="4"/>
+              <w:right w:val="single" w:color="C9CFD8" w:sz="4"/>
+            </w:tcBorders>
+            <w:tcMar>
+              <w:top w:type="dxa" w:w="50"/>
+              <w:left w:type="dxa" w:w="90"/>
+              <w:bottom w:type="dxa" w:w="50"/>
+              <w:right w:type="dxa" w:w="90"/>
+            </w:tcMar>
+            <w:vAlign w:val="center"/>
+          </w:tcPr>
+          <w:p>
+            <w:pPr>
+              <w:spacing w:after="0"/>
+            </w:pPr>
+            <w:r>
+              <w:rPr>
+                <w:rFonts w:ascii="Calibri" w:cs="Calibri" w:eastAsia="Calibri" w:hAnsi="Calibri"/>
+                <w:sz w:val="17"/>
+                <w:szCs w:val="17"/>
+              </w:rPr>
+              <w:t xml:space="preserve">l'adresse de la recette suivie de /mobile</w:t>
+            </w:r>
+          </w:p>
+        </w:tc>
+        <w:tc>
+          <w:tcPr>
+            <w:tcW w:type="dxa" w:w="3470"/>
+            <w:tcBorders>
+              <w:top w:val="single" w:color="C9CFD8" w:sz="4"/>
+              <w:left w:val="single" w:color="C9CFD8" w:sz="4"/>
+              <w:bottom w:val="single" w:color="C9CFD8" w:sz="4"/>
+              <w:right w:val="single" w:color="C9CFD8" w:sz="4"/>
+            </w:tcBorders>
+            <w:tcMar>
+              <w:top w:type="dxa" w:w="50"/>
+              <w:left w:type="dxa" w:w="90"/>
+              <w:bottom w:type="dxa" w:w="50"/>
+              <w:right w:type="dxa" w:w="90"/>
+            </w:tcMar>
+            <w:vAlign w:val="center"/>
+          </w:tcPr>
+          <w:p>
+            <w:pPr>
+              <w:spacing w:after="0"/>
+            </w:pPr>
+            <w:r>
+              <w:rPr>
+                <w:rFonts w:ascii="Calibri" w:cs="Calibri" w:eastAsia="Calibri" w:hAnsi="Calibri"/>
+                <w:sz w:val="17"/>
+                <w:szCs w:val="17"/>
+              </w:rPr>
+              <w:t xml:space="preserve">test.exploitation, test.parc</w:t>
+            </w:r>
+          </w:p>
+        </w:tc>
+      </w:tr>
+      <w:tr>
+        <w:tc>
+          <w:tcPr>
+            <w:tcW w:type="dxa" w:w="2891"/>
+            <w:tcBorders>
+              <w:top w:val="single" w:color="C9CFD8" w:sz="4"/>
+              <w:left w:val="single" w:color="C9CFD8" w:sz="4"/>
+              <w:bottom w:val="single" w:color="C9CFD8" w:sz="4"/>
+              <w:right w:val="single" w:color="C9CFD8" w:sz="4"/>
+            </w:tcBorders>
+            <w:shd w:fill="F2F4F7" w:color="auto" w:val="clear"/>
+            <w:tcMar>
+              <w:top w:type="dxa" w:w="50"/>
+              <w:left w:type="dxa" w:w="90"/>
+              <w:bottom w:type="dxa" w:w="50"/>
+              <w:right w:type="dxa" w:w="90"/>
+            </w:tcMar>
+            <w:vAlign w:val="center"/>
+          </w:tcPr>
+          <w:p>
+            <w:pPr>
+              <w:spacing w:after="0"/>
+            </w:pPr>
+            <w:r>
+              <w:rPr>
+                <w:rFonts w:ascii="Calibri" w:cs="Calibri" w:eastAsia="Calibri" w:hAnsi="Calibri"/>
+                <w:sz w:val="17"/>
+                <w:szCs w:val="17"/>
+              </w:rPr>
+              <w:t xml:space="preserve">Portail des porteurs de projets</w:t>
+            </w:r>
+          </w:p>
+        </w:tc>
+        <w:tc>
+          <w:tcPr>
+            <w:tcW w:type="dxa" w:w="3277"/>
+            <w:tcBorders>
+              <w:top w:val="single" w:color="C9CFD8" w:sz="4"/>
+              <w:left w:val="single" w:color="C9CFD8" w:sz="4"/>
+              <w:bottom w:val="single" w:color="C9CFD8" w:sz="4"/>
+              <w:right w:val="single" w:color="C9CFD8" w:sz="4"/>
+            </w:tcBorders>
+            <w:shd w:fill="F2F4F7" w:color="auto" w:val="clear"/>
+            <w:tcMar>
+              <w:top w:type="dxa" w:w="50"/>
+              <w:left w:type="dxa" w:w="90"/>
+              <w:bottom w:type="dxa" w:w="50"/>
+              <w:right w:type="dxa" w:w="90"/>
+            </w:tcMar>
+            <w:vAlign w:val="center"/>
+          </w:tcPr>
+          <w:p>
+            <w:pPr>
+              <w:spacing w:after="0"/>
+            </w:pPr>
+            <w:r>
+              <w:rPr>
+                <w:rFonts w:ascii="Calibri" w:cs="Calibri" w:eastAsia="Calibri" w:hAnsi="Calibri"/>
+                <w:sz w:val="17"/>
+                <w:szCs w:val="17"/>
+              </w:rPr>
+              <w:t xml:space="preserve">l'adresse de la recette suivie de /portail</w:t>
+            </w:r>
+          </w:p>
+        </w:tc>
+        <w:tc>
+          <w:tcPr>
+            <w:tcW w:type="dxa" w:w="3470"/>
+            <w:tcBorders>
+              <w:top w:val="single" w:color="C9CFD8" w:sz="4"/>
+              <w:left w:val="single" w:color="C9CFD8" w:sz="4"/>
+              <w:bottom w:val="single" w:color="C9CFD8" w:sz="4"/>
+              <w:right w:val="single" w:color="C9CFD8" w:sz="4"/>
+            </w:tcBorders>
+            <w:shd w:fill="F2F4F7" w:color="auto" w:val="clear"/>
+            <w:tcMar>
+              <w:top w:type="dxa" w:w="50"/>
+              <w:left w:type="dxa" w:w="90"/>
+              <w:bottom w:type="dxa" w:w="50"/>
+              <w:right w:type="dxa" w:w="90"/>
+            </w:tcMar>
+            <w:vAlign w:val="center"/>
+          </w:tcPr>
+          <w:p>
+            <w:pPr>
+              <w:spacing w:after="0"/>
+            </w:pPr>
+            <w:r>
+              <w:rPr>
+                <w:rFonts w:ascii="Calibri" w:cs="Calibri" w:eastAsia="Calibri" w:hAnsi="Calibri"/>
+                <w:sz w:val="17"/>
+                <w:szCs w:val="17"/>
+              </w:rPr>
+              <w:t xml:space="preserve">test.porteur, porteur.demo</w:t>
+            </w:r>
+          </w:p>
+        </w:tc>
+      </w:tr>
+    </w:tbl>
+    <w:p>
+      <w:pPr>
+        <w:spacing w:after="80"/>
+      </w:pPr>
     </w:p>
     <w:p>
       <w:pPr>
@@ -11134,7 +11860,7 @@
           <w:sz w:val="20"/>
           <w:szCs w:val="20"/>
         </w:rPr>
-        <w:t xml:space="preserve">Survolez le message de test.daf et cliquez sur « Répondre ». La citation s'affiche au-dessus du champ ; écrivez une réponse et envoyez-la.</w:t>
+        <w:t xml:space="preserve">Sous le message de test.daf, cliquez sur « Répondre ». La citation s'affiche au-dessus du champ ; écrivez une réponse et envoyez-la.</w:t>
       </w:r>
     </w:p>
     <w:p>
@@ -11163,7 +11889,7 @@
           <w:sz w:val="20"/>
           <w:szCs w:val="20"/>
         </w:rPr>
-        <w:t xml:space="preserve">Sur votre propre message, cliquez sur « Retirer ». À la question « Retirer ce message ? », cliquez sur « Retirer ».</w:t>
+        <w:t xml:space="preserve">Sous votre propre message, cliquez sur « Retirer ». À la question « Retirer ce message ? », cliquez d'abord sur « Annuler », puis recommencez et cliquez sur « Retirer ».</w:t>
       </w:r>
     </w:p>
     <w:p>
@@ -11192,7 +11918,7 @@
           <w:sz w:val="20"/>
           <w:szCs w:val="20"/>
         </w:rPr>
-        <w:t xml:space="preserve">Regardez la conversation avec test.daf.</w:t>
+        <w:t xml:space="preserve">Regardez la conversation chez test.daf.</w:t>
       </w:r>
     </w:p>
     <w:p>
@@ -11206,7 +11932,7 @@
           <w:sz w:val="20"/>
           <w:szCs w:val="20"/>
         </w:rPr>
-        <w:t xml:space="preserve">Résultat attendu : la réponse montre l'extrait du message cité. Le message retiré affiche « Message retiré par vous. » chez test.comptable et « Message retiré par son auteur. » chez test.daf ; son texte n'est plus lisible.</w:t>
+        <w:t xml:space="preserve">Résultat attendu : la réponse porte « En réponse à … » et l'extrait du message cité. « Annuler » garde le message. Le message retiré affiche « Message retiré par vous. » chez test.comptable et « Message retiré par son auteur. » chez test.daf ; son texte n'est plus lisible. Seuls vos propres messages proposent « Retirer ».</w:t>
       </w:r>
     </w:p>
     <w:tbl>
@@ -11476,7 +12202,7 @@
           <w:sz w:val="20"/>
           <w:szCs w:val="20"/>
         </w:rPr>
-        <w:t xml:space="preserve">Données : un fichier PDF ; une archive .zip ; un fichier de plus de 20 Mo.</w:t>
+        <w:t xml:space="preserve">Données : un fichier PDF ; une archive .zip ; un fichier de plus de 20 Mo ; six petits fichiers PDF.</w:t>
       </w:r>
     </w:p>
     <w:p>
@@ -11568,6 +12294,35 @@
     </w:p>
     <w:p>
       <w:pPr>
+        <w:tabs>
+          <w:tab w:val="left" w:pos="360"/>
+        </w:tabs>
+        <w:spacing w:after="60"/>
+        <w:ind w:left="360" w:hanging="360"/>
+        <w:jc w:val="both"/>
+      </w:pPr>
+      <w:r>
+        <w:rPr>
+          <w:rFonts w:ascii="Calibri" w:cs="Calibri" w:eastAsia="Calibri" w:hAnsi="Calibri"/>
+          <w:b/>
+          <w:bCs/>
+          <w:color w:val="1A9E9E"/>
+          <w:sz w:val="20"/>
+          <w:szCs w:val="20"/>
+        </w:rPr>
+        <w:t xml:space="preserve">4.	</w:t>
+      </w:r>
+      <w:r>
+        <w:rPr>
+          <w:rFonts w:ascii="Calibri" w:cs="Calibri" w:eastAsia="Calibri" w:hAnsi="Calibri"/>
+          <w:sz w:val="20"/>
+          <w:szCs w:val="20"/>
+        </w:rPr>
+        <w:t xml:space="preserve">Choisissez les six PDF d'un coup.</w:t>
+      </w:r>
+    </w:p>
+    <w:p>
+      <w:pPr>
         <w:spacing w:after="100"/>
         <w:jc w:val="both"/>
       </w:pPr>
@@ -11577,7 +12332,7 @@
           <w:sz w:val="20"/>
           <w:szCs w:val="20"/>
         </w:rPr>
-        <w:t xml:space="preserve">Résultat attendu : le PDF arrive et s'ouvre chez le correspondant. L'archive est refusée : « (nom du fichier) : format refusé. Formats acceptés : PDF, JPEG, PNG, Word (.docx) ou Excel (.xlsx). Enregistrez le document dans l'un de ces formats. ». Le gros fichier est refusé : « (nom du fichier) : fichier trop volumineux (20 Mo au plus). ».</w:t>
+        <w:t xml:space="preserve">Résultat attendu : le PDF arrive et se télécharge chez le correspondant. L'archive est refusée à l'envoi : « (nom du fichier) : format refusé. Formats acceptés : PDF, JPEG, PNG, Word (.docx) ou Excel (.xlsx). Enregistrez le document dans l'un de ces formats. ». Le gros fichier est refusé dès son choix : « (nom du fichier) : fichier trop volumineux (20 Mo au plus). ». Les six PDF aussi : « 5 pièces jointes au plus par message. ».</w:t>
       </w:r>
     </w:p>
     <w:tbl>
@@ -11934,7 +12689,7 @@
           <w:sz w:val="20"/>
           <w:szCs w:val="20"/>
         </w:rPr>
-        <w:t xml:space="preserve">Cliquez sur « Membres (3) ». Vérifiez la mention « Responsable » à côté de votre nom.</w:t>
+        <w:t xml:space="preserve">En haut de la conversation, cliquez sur le bouton des membres (icône et nombre 3). La vue « Membres (3) » s'ouvre : vérifiez la mention « Responsable » à côté de votre nom.</w:t>
       </w:r>
     </w:p>
     <w:p>
@@ -11963,7 +12718,7 @@
           <w:sz w:val="20"/>
           <w:szCs w:val="20"/>
         </w:rPr>
-        <w:t xml:space="preserve">test.comptable : ouvrez le groupe, puis « Membres (3) ».</w:t>
+        <w:t xml:space="preserve">test.comptable : ouvrez le groupe, puis le bouton des membres.</w:t>
       </w:r>
     </w:p>
     <w:p>
@@ -12021,7 +12776,7 @@
           <w:sz w:val="20"/>
           <w:szCs w:val="20"/>
         </w:rPr>
-        <w:t xml:space="preserve">test.daf : dans « Membres », ajoutez de nouveau Test - Comptable avec « Ajouter un collègue ».</w:t>
+        <w:t xml:space="preserve">test.daf : dans « Membres », cliquez sur « Ajouter des membres », puis, sous « Ajouter un collègue », choisissez Test - Comptable.</w:t>
       </w:r>
     </w:p>
     <w:p>
@@ -12035,7 +12790,7 @@
           <w:sz w:val="20"/>
           <w:szCs w:val="20"/>
         </w:rPr>
-        <w:t xml:space="preserve">Résultat attendu : le bouton « Créer le groupe » reste grisé sans nom ou sans membre. Chez test.daf, « Renommer », « Retirer » (pour chaque membre) et « Ajouter un collègue » sont proposés ; chez test.comptable, ils ne le sont pas. Avant de quitter, la question « Quitter ce groupe ? Seul son responsable pourra vous y ajouter de nouveau. » s'affiche. Rajouté, test.comptable relit tout l'historique.</w:t>
+        <w:t xml:space="preserve">Résultat attendu : le bouton « Créer le groupe » reste grisé sans nom ou sans membre. Chez test.daf, « Renommer », « Retirer » (pour chaque membre) et « Ajouter des membres » sont proposés ; chez test.comptable, ils ne le sont pas. Avant de quitter, la question « Quitter ce groupe ? Seul son responsable pourra vous y ajouter de nouveau. » s'affiche. À l'étape 6, « Test - Comptable a rejoint le groupe. » ; rajouté, test.comptable relit tout l'historique.</w:t>
       </w:r>
     </w:p>
     <w:tbl>
@@ -12421,7 +13176,7 @@
           <w:sz w:val="20"/>
           <w:szCs w:val="20"/>
         </w:rPr>
-        <w:t xml:space="preserve">test.daf : dans la conversation, cliquez sur le lien qui ouvre la fiche.</w:t>
+        <w:t xml:space="preserve">test.daf : en haut de la conversation, cliquez sur « Fiche ».</w:t>
       </w:r>
     </w:p>
     <w:p>
@@ -12435,7 +13190,7 @@
           <w:sz w:val="20"/>
           <w:szCs w:val="20"/>
         </w:rPr>
-        <w:t xml:space="preserve">Résultat attendu : le panneau s'ouvre sur « Discussion de la fiche », avec la mention « Discussion de la fiche, ouverte à ses lecteurs ». test.daf y lit le message de test.chantiers et peut répondre. Le lien ramène à l'écran BTP. Le même bouton existe sur une rotation (Transport), un bien (Immobilier) et un dossier (AxisPro).</w:t>
+        <w:t xml:space="preserve">Résultat attendu : le panneau s'ouvre sur « Discussion de la fiche », avec la mention « Discussion de la fiche, ouverte à ses lecteurs ». test.daf y lit le message de test.chantiers et peut répondre. « Fiche » ramène à l'écran BTP. Le même bouton existe sur une rotation (Transport), un bien (Immobilier) et un dossier (AxisPro).</w:t>
       </w:r>
     </w:p>
     <w:tbl>
@@ -13023,26 +13778,6 @@
     <w:p>
       <w:pPr>
         <w:keepNext/>
-        <w:pBdr>
-          <w:bottom w:val="single" w:color="1A9E9E" w:sz="6" w:space="2"/>
-        </w:pBdr>
-        <w:spacing w:after="100" w:before="280"/>
-      </w:pPr>
-      <w:r>
-        <w:rPr>
-          <w:rFonts w:ascii="Calibri" w:cs="Calibri" w:eastAsia="Calibri" w:hAnsi="Calibri"/>
-          <w:b/>
-          <w:bCs/>
-          <w:color w:val="1C1E6B"/>
-          <w:sz w:val="26"/>
-          <w:szCs w:val="26"/>
-        </w:rPr>
-        <w:t xml:space="preserve">G. Refus attendus</w:t>
-      </w:r>
-    </w:p>
-    <w:p>
-      <w:pPr>
-        <w:keepNext/>
         <w:spacing w:after="100" w:before="200"/>
       </w:pPr>
       <w:r>
@@ -13054,7 +13789,7 @@
           <w:sz w:val="22"/>
           <w:szCs w:val="22"/>
         </w:rPr>
-        <w:t xml:space="preserve">SOC-28. Application non ouverte au profil</w:t>
+        <w:t xml:space="preserve">SOC-28. Retirer un compte désactivé de ses discussions</w:t>
       </w:r>
     </w:p>
     <w:p>
@@ -13068,7 +13803,7 @@
           <w:sz w:val="20"/>
           <w:szCs w:val="20"/>
         </w:rPr>
-        <w:t xml:space="preserve">Objectif : vérifier qu'un compte ne peut pas ouvrir une application que son profil n'ouvre pas.</w:t>
+        <w:t xml:space="preserve">Objectif : vérifier que l'administration retire un compte parti de toutes ses conversations, sans les lire.</w:t>
       </w:r>
     </w:p>
     <w:p>
@@ -13082,7 +13817,7 @@
           <w:sz w:val="20"/>
           <w:szCs w:val="20"/>
         </w:rPr>
-        <w:t xml:space="preserve">Compte : test.consultant.</w:t>
+        <w:t xml:space="preserve">Compte : test.admin, avec test.daf.</w:t>
       </w:r>
     </w:p>
     <w:p>
@@ -13096,7 +13831,7 @@
           <w:sz w:val="20"/>
           <w:szCs w:val="20"/>
         </w:rPr>
-        <w:t xml:space="preserve">Données : aucune.</w:t>
+        <w:t xml:space="preserve">Données : le groupe « Clôture d'octobre (essai) » de SOC-25 ; un compte créé pour l'essai, ouvert aux deux sociétés (par exemple celui du scénario FIN-38 du cahier Finance).</w:t>
       </w:r>
     </w:p>
     <w:p>
@@ -13125,7 +13860,7 @@
           <w:sz w:val="20"/>
           <w:szCs w:val="20"/>
         </w:rPr>
-        <w:t xml:space="preserve">Ouvrez l'adresse de la recette (connexion à Finance) et connectez-vous avec test.consultant.</w:t>
+        <w:t xml:space="preserve">test.daf : dans les membres du groupe, ajoutez le compte d'essai (« Ajouter des membres »).</w:t>
       </w:r>
     </w:p>
     <w:p>
@@ -13154,7 +13889,7 @@
           <w:sz w:val="20"/>
           <w:szCs w:val="20"/>
         </w:rPr>
-        <w:t xml:space="preserve">Ouvrez l'adresse de la recette suivie de /axispro et connectez-vous : l'accueil ne montre pas de rayon Finance.</w:t>
+        <w:t xml:space="preserve">test.admin : Finance &gt; Administration &gt; Utilisateurs, ouvrez la fiche du compte d'essai, cliquez sur « Désactiver » et confirmez.</w:t>
       </w:r>
     </w:p>
     <w:p>
@@ -13183,7 +13918,7 @@
           <w:sz w:val="20"/>
           <w:szCs w:val="20"/>
         </w:rPr>
-        <w:t xml:space="preserve">Dans la barre d'adresse du navigateur, remplacez la fin de l'adresse par /finance et validez.</w:t>
+        <w:t xml:space="preserve">test.daf : ouvrez les membres du groupe.</w:t>
       </w:r>
     </w:p>
     <w:p>
@@ -13212,7 +13947,36 @@
           <w:sz w:val="20"/>
           <w:szCs w:val="20"/>
         </w:rPr>
-        <w:t xml:space="preserve">Cliquez sur le bouton proposé.</w:t>
+        <w:t xml:space="preserve">test.admin : sur la fiche du compte désactivé, cliquez sur « Retirer des discussions ». Lisez la fenêtre, puis « Retirer ».</w:t>
+      </w:r>
+    </w:p>
+    <w:p>
+      <w:pPr>
+        <w:tabs>
+          <w:tab w:val="left" w:pos="360"/>
+        </w:tabs>
+        <w:spacing w:after="60"/>
+        <w:ind w:left="360" w:hanging="360"/>
+        <w:jc w:val="both"/>
+      </w:pPr>
+      <w:r>
+        <w:rPr>
+          <w:rFonts w:ascii="Calibri" w:cs="Calibri" w:eastAsia="Calibri" w:hAnsi="Calibri"/>
+          <w:b/>
+          <w:bCs/>
+          <w:color w:val="1A9E9E"/>
+          <w:sz w:val="20"/>
+          <w:szCs w:val="20"/>
+        </w:rPr>
+        <w:t xml:space="preserve">5.	</w:t>
+      </w:r>
+      <w:r>
+        <w:rPr>
+          <w:rFonts w:ascii="Calibri" w:cs="Calibri" w:eastAsia="Calibri" w:hAnsi="Calibri"/>
+          <w:sz w:val="20"/>
+          <w:szCs w:val="20"/>
+        </w:rPr>
+        <w:t xml:space="preserve">test.daf : rouvrez les membres du groupe.</w:t>
       </w:r>
     </w:p>
     <w:p>
@@ -13226,7 +13990,7 @@
           <w:sz w:val="20"/>
           <w:szCs w:val="20"/>
         </w:rPr>
-        <w:t xml:space="preserve">Résultat attendu : à l'étape 1, « Votre profil ne donne pas accès à cette application. ». À l'étape 3, la page « Accès non ouvert à votre profil » s'affiche : « Votre profil ne donne pas accès à NIMOVA · Finance. Si votre travail le demande, l'administrateur de la plateforme peut vous ouvrir ce profil. ». Aucun chiffre de Finance n'est montré. Le bouton « Aller à MB AxisPro Consulting » ouvre AxisPro.</w:t>
+        <w:t xml:space="preserve">Résultat attendu : à l'étape 3, le compte figure avec la mention « Compte archivé ». La fenêtre « Retirer des discussions » précise que les autres membres gardent l'historique et que l'administration n'en lira aucune ; ensuite, « Compte retiré de 1 conversation. ». À l'étape 5, le compte n'est plus membre ; les messages du groupe restent.</w:t>
       </w:r>
     </w:p>
     <w:tbl>
@@ -13443,6 +14207,26 @@
     <w:p>
       <w:pPr>
         <w:keepNext/>
+        <w:pBdr>
+          <w:bottom w:val="single" w:color="1A9E9E" w:sz="6" w:space="2"/>
+        </w:pBdr>
+        <w:spacing w:after="100" w:before="280"/>
+      </w:pPr>
+      <w:r>
+        <w:rPr>
+          <w:rFonts w:ascii="Calibri" w:cs="Calibri" w:eastAsia="Calibri" w:hAnsi="Calibri"/>
+          <w:b/>
+          <w:bCs/>
+          <w:color w:val="1C1E6B"/>
+          <w:sz w:val="26"/>
+          <w:szCs w:val="26"/>
+        </w:rPr>
+        <w:t xml:space="preserve">G. Refus attendus</w:t>
+      </w:r>
+    </w:p>
+    <w:p>
+      <w:pPr>
+        <w:keepNext/>
         <w:spacing w:after="100" w:before="200"/>
       </w:pPr>
       <w:r>
@@ -13454,7 +14238,7 @@
           <w:sz w:val="22"/>
           <w:szCs w:val="22"/>
         </w:rPr>
-        <w:t xml:space="preserve">SOC-29. Collègue d'une autre société non proposé</w:t>
+        <w:t xml:space="preserve">SOC-29. Application non ouverte au profil</w:t>
       </w:r>
     </w:p>
     <w:p>
@@ -13468,7 +14252,7 @@
           <w:sz w:val="20"/>
           <w:szCs w:val="20"/>
         </w:rPr>
-        <w:t xml:space="preserve">Objectif : vérifier que la discussion ne propose que des collègues qui partagent une société avec vous.</w:t>
+        <w:t xml:space="preserve">Objectif : vérifier qu'un compte ne peut pas ouvrir une application que son profil n'ouvre pas.</w:t>
       </w:r>
     </w:p>
     <w:p>
@@ -13482,7 +14266,7 @@
           <w:sz w:val="20"/>
           <w:szCs w:val="20"/>
         </w:rPr>
-        <w:t xml:space="preserve">Compte : test.consultant (MB AxisPro Consulting seulement).</w:t>
+        <w:t xml:space="preserve">Compte : test.consultant.</w:t>
       </w:r>
     </w:p>
     <w:p>
@@ -13496,7 +14280,7 @@
           <w:sz w:val="20"/>
           <w:szCs w:val="20"/>
         </w:rPr>
-        <w:t xml:space="preserve">Données : le collègue « Test - Agent de parc » (EGUITRA GROUP SARLU seulement).</w:t>
+        <w:t xml:space="preserve">Données : aucune.</w:t>
       </w:r>
     </w:p>
     <w:p>
@@ -13525,7 +14309,7 @@
           <w:sz w:val="20"/>
           <w:szCs w:val="20"/>
         </w:rPr>
-        <w:t xml:space="preserve">Ouvrez la discussion, « Nouvelle », « À deux ».</w:t>
+        <w:t xml:space="preserve">Ouvrez l'adresse de la recette (connexion à Finance) et connectez-vous avec test.consultant.</w:t>
       </w:r>
     </w:p>
     <w:p>
@@ -13554,7 +14338,7 @@
           <w:sz w:val="20"/>
           <w:szCs w:val="20"/>
         </w:rPr>
-        <w:t xml:space="preserve">Sous « À qui écrire ? », saisissez « parc ».</w:t>
+        <w:t xml:space="preserve">Ouvrez l'adresse de la recette suivie de /axispro et connectez-vous : l'accueil ne montre pas de rayon Finance.</w:t>
       </w:r>
     </w:p>
     <w:p>
@@ -13583,7 +14367,36 @@
           <w:sz w:val="20"/>
           <w:szCs w:val="20"/>
         </w:rPr>
-        <w:t xml:space="preserve">Saisissez ensuite « directeur » ou « Direction ».</w:t>
+        <w:t xml:space="preserve">Dans la barre d'adresse du navigateur, remplacez la fin de l'adresse par /finance et validez.</w:t>
+      </w:r>
+    </w:p>
+    <w:p>
+      <w:pPr>
+        <w:tabs>
+          <w:tab w:val="left" w:pos="360"/>
+        </w:tabs>
+        <w:spacing w:after="60"/>
+        <w:ind w:left="360" w:hanging="360"/>
+        <w:jc w:val="both"/>
+      </w:pPr>
+      <w:r>
+        <w:rPr>
+          <w:rFonts w:ascii="Calibri" w:cs="Calibri" w:eastAsia="Calibri" w:hAnsi="Calibri"/>
+          <w:b/>
+          <w:bCs/>
+          <w:color w:val="1A9E9E"/>
+          <w:sz w:val="20"/>
+          <w:szCs w:val="20"/>
+        </w:rPr>
+        <w:t xml:space="preserve">4.	</w:t>
+      </w:r>
+      <w:r>
+        <w:rPr>
+          <w:rFonts w:ascii="Calibri" w:cs="Calibri" w:eastAsia="Calibri" w:hAnsi="Calibri"/>
+          <w:sz w:val="20"/>
+          <w:szCs w:val="20"/>
+        </w:rPr>
+        <w:t xml:space="preserve">Cliquez sur le bouton proposé.</w:t>
       </w:r>
     </w:p>
     <w:p>
@@ -13597,7 +14410,7 @@
           <w:sz w:val="20"/>
           <w:szCs w:val="20"/>
         </w:rPr>
-        <w:t xml:space="preserve">Résultat attendu : « Test - Agent de parc » n'est pas proposé (« Aucun collègue à proposer. »). Test - Direction générale, ouvert aux deux sociétés, est proposé.</w:t>
+        <w:t xml:space="preserve">Résultat attendu : à l'étape 1, « Votre profil ne donne pas accès à cette application. ». À l'étape 3, la page « Accès non ouvert à votre profil » s'affiche : « Votre profil ne donne pas accès à NIMOVA · Finance. Si votre travail le demande, l'administrateur de la plateforme peut vous ouvrir ce profil. ». Aucun chiffre de Finance n'est montré. Le bouton « Aller à MB AxisPro Consulting » ouvre AxisPro.</w:t>
       </w:r>
     </w:p>
     <w:tbl>
@@ -13825,7 +14638,7 @@
           <w:sz w:val="22"/>
           <w:szCs w:val="22"/>
         </w:rPr>
-        <w:t xml:space="preserve">SOC-30. Conversation fermée à l'administration</w:t>
+        <w:t xml:space="preserve">SOC-30. Collègue d'une autre société non proposé</w:t>
       </w:r>
     </w:p>
     <w:p>
@@ -13839,7 +14652,7 @@
           <w:sz w:val="20"/>
           <w:szCs w:val="20"/>
         </w:rPr>
-        <w:t xml:space="preserve">Objectif : vérifier que l'administration ne lit pas une conversation dont elle n'est pas membre.</w:t>
+        <w:t xml:space="preserve">Objectif : vérifier que la discussion ne propose que des collègues qui partagent une société avec vous.</w:t>
       </w:r>
     </w:p>
     <w:p>
@@ -13853,7 +14666,7 @@
           <w:sz w:val="20"/>
           <w:szCs w:val="20"/>
         </w:rPr>
-        <w:t xml:space="preserve">Compte : test.admin.</w:t>
+        <w:t xml:space="preserve">Compte : test.consultant (MB AxisPro Consulting seulement).</w:t>
       </w:r>
     </w:p>
     <w:p>
@@ -13867,7 +14680,7 @@
           <w:sz w:val="20"/>
           <w:szCs w:val="20"/>
         </w:rPr>
-        <w:t xml:space="preserve">Données : la conversation à deux de test.daf et test.comptable (SOC-22).</w:t>
+        <w:t xml:space="preserve">Données : le collègue « Test - Agent de parc » (EGUITRA GROUP SARLU seulement).</w:t>
       </w:r>
     </w:p>
     <w:p>
@@ -13896,7 +14709,7 @@
           <w:sz w:val="20"/>
           <w:szCs w:val="20"/>
         </w:rPr>
-        <w:t xml:space="preserve">Ouvrez la discussion de test.admin et parcourez la liste « Conversations ».</w:t>
+        <w:t xml:space="preserve">Ouvrez la discussion, « Nouvelle », « À deux ».</w:t>
       </w:r>
     </w:p>
     <w:p>
@@ -13925,7 +14738,36 @@
           <w:sz w:val="20"/>
           <w:szCs w:val="20"/>
         </w:rPr>
-        <w:t xml:space="preserve">Recherchez « Comptable » dans le champ de recherche de la liste.</w:t>
+        <w:t xml:space="preserve">Sous « À qui écrire ? », saisissez « parc ».</w:t>
+      </w:r>
+    </w:p>
+    <w:p>
+      <w:pPr>
+        <w:tabs>
+          <w:tab w:val="left" w:pos="360"/>
+        </w:tabs>
+        <w:spacing w:after="60"/>
+        <w:ind w:left="360" w:hanging="360"/>
+        <w:jc w:val="both"/>
+      </w:pPr>
+      <w:r>
+        <w:rPr>
+          <w:rFonts w:ascii="Calibri" w:cs="Calibri" w:eastAsia="Calibri" w:hAnsi="Calibri"/>
+          <w:b/>
+          <w:bCs/>
+          <w:color w:val="1A9E9E"/>
+          <w:sz w:val="20"/>
+          <w:szCs w:val="20"/>
+        </w:rPr>
+        <w:t xml:space="preserve">3.	</w:t>
+      </w:r>
+      <w:r>
+        <w:rPr>
+          <w:rFonts w:ascii="Calibri" w:cs="Calibri" w:eastAsia="Calibri" w:hAnsi="Calibri"/>
+          <w:sz w:val="20"/>
+          <w:szCs w:val="20"/>
+        </w:rPr>
+        <w:t xml:space="preserve">Saisissez ensuite « directeur » ou « Direction ».</w:t>
       </w:r>
     </w:p>
     <w:p>
@@ -13939,7 +14781,7 @@
           <w:sz w:val="20"/>
           <w:szCs w:val="20"/>
         </w:rPr>
-        <w:t xml:space="preserve">Résultat attendu : la conversation entre test.daf et test.comptable n'apparaît pas. test.admin ne voit que ses propres conversations.</w:t>
+        <w:t xml:space="preserve">Résultat attendu : « Test - Agent de parc » n'est pas proposé (« Aucun collègue à proposer. »). Test - Direction générale, ouvert aux deux sociétés, est proposé.</w:t>
       </w:r>
     </w:p>
     <w:tbl>
@@ -14167,7 +15009,7 @@
           <w:sz w:val="22"/>
           <w:szCs w:val="22"/>
         </w:rPr>
-        <w:t xml:space="preserve">SOC-31. Pas de discussion ni de demandes pour le salarié et le porteur</w:t>
+        <w:t xml:space="preserve">SOC-31. Conversation fermée à l'administration</w:t>
       </w:r>
     </w:p>
     <w:p>
@@ -14181,7 +15023,7 @@
           <w:sz w:val="20"/>
           <w:szCs w:val="20"/>
         </w:rPr>
-        <w:t xml:space="preserve">Objectif : vérifier que la discussion interne est réservée aux comptes internes qui ont un profil, et « Mes demandes » aux comptes internes.</w:t>
+        <w:t xml:space="preserve">Objectif : vérifier que l'administration ne lit pas une conversation dont elle n'est pas membre.</w:t>
       </w:r>
     </w:p>
     <w:p>
@@ -14195,7 +15037,7 @@
           <w:sz w:val="20"/>
           <w:szCs w:val="20"/>
         </w:rPr>
-        <w:t xml:space="preserve">Compte : test.salarie, puis test.porteur.</w:t>
+        <w:t xml:space="preserve">Compte : test.admin.</w:t>
       </w:r>
     </w:p>
     <w:p>
@@ -14209,7 +15051,7 @@
           <w:sz w:val="20"/>
           <w:szCs w:val="20"/>
         </w:rPr>
-        <w:t xml:space="preserve">Données : aucune.</w:t>
+        <w:t xml:space="preserve">Données : la conversation à deux de test.daf et test.comptable (SOC-22).</w:t>
       </w:r>
     </w:p>
     <w:p>
@@ -14238,7 +15080,7 @@
           <w:sz w:val="20"/>
           <w:szCs w:val="20"/>
         </w:rPr>
-        <w:t xml:space="preserve">test.salarie : ouvrez l'adresse de la recette suivie de /rh et connectez-vous. Regardez la barre du haut de « Mon espace ».</w:t>
+        <w:t xml:space="preserve">Ouvrez la discussion de test.admin et parcourez la liste « Conversations ».</w:t>
       </w:r>
     </w:p>
     <w:p>
@@ -14267,7 +15109,7 @@
           <w:sz w:val="20"/>
           <w:szCs w:val="20"/>
         </w:rPr>
-        <w:t xml:space="preserve">test.porteur : ouvrez l'adresse de la recette suivie de /portail et connectez-vous. Ouvrez le menu de votre compte.</w:t>
+        <w:t xml:space="preserve">Recherchez « Comptable » dans le champ de recherche de la liste.</w:t>
       </w:r>
     </w:p>
     <w:p>
@@ -14281,7 +15123,7 @@
           <w:sz w:val="20"/>
           <w:szCs w:val="20"/>
         </w:rPr>
-        <w:t xml:space="preserve">Résultat attendu : test.salarie ne voit pas l'icône de discussion. test.porteur ne voit ni l'icône de discussion ni « Mes demandes » : il écrit au cabinet par « Messages » du portail.</w:t>
+        <w:t xml:space="preserve">Résultat attendu : la conversation entre test.daf et test.comptable n'apparaît pas. test.admin ne voit que ses propres conversations.</w:t>
       </w:r>
     </w:p>
     <w:tbl>
@@ -14498,26 +15340,6 @@
     <w:p>
       <w:pPr>
         <w:keepNext/>
-        <w:pBdr>
-          <w:bottom w:val="single" w:color="1A9E9E" w:sz="6" w:space="2"/>
-        </w:pBdr>
-        <w:spacing w:after="100" w:before="280"/>
-      </w:pPr>
-      <w:r>
-        <w:rPr>
-          <w:rFonts w:ascii="Calibri" w:cs="Calibri" w:eastAsia="Calibri" w:hAnsi="Calibri"/>
-          <w:b/>
-          <w:bCs/>
-          <w:color w:val="1C1E6B"/>
-          <w:sz w:val="26"/>
-          <w:szCs w:val="26"/>
-        </w:rPr>
-        <w:t xml:space="preserve">H. Contrôles de saisie et de sécurité</w:t>
-      </w:r>
-    </w:p>
-    <w:p>
-      <w:pPr>
-        <w:keepNext/>
         <w:spacing w:after="100" w:before="200"/>
       </w:pPr>
       <w:r>
@@ -14529,7 +15351,7 @@
           <w:sz w:val="22"/>
           <w:szCs w:val="22"/>
         </w:rPr>
-        <w:t xml:space="preserve">SOC-32. Message clair en cas de coupure du réseau</w:t>
+        <w:t xml:space="preserve">SOC-32. Pas de discussion ni de demandes pour le salarié et le porteur</w:t>
       </w:r>
     </w:p>
     <w:p>
@@ -14543,7 +15365,7 @@
           <w:sz w:val="20"/>
           <w:szCs w:val="20"/>
         </w:rPr>
-        <w:t xml:space="preserve">Objectif : vérifier qu'une coupure du réseau est annoncée par un message en français.</w:t>
+        <w:t xml:space="preserve">Objectif : vérifier que la discussion interne est réservée aux comptes internes qui ont un profil, et « Mes demandes » aux comptes internes.</w:t>
       </w:r>
     </w:p>
     <w:p>
@@ -14557,7 +15379,7 @@
           <w:sz w:val="20"/>
           <w:szCs w:val="20"/>
         </w:rPr>
-        <w:t xml:space="preserve">Compte : test.comptable.</w:t>
+        <w:t xml:space="preserve">Compte : test.salarie, puis test.porteur.</w:t>
       </w:r>
     </w:p>
     <w:p>
@@ -14571,7 +15393,7 @@
           <w:sz w:val="20"/>
           <w:szCs w:val="20"/>
         </w:rPr>
-        <w:t xml:space="preserve">Données : un poste dont on peut couper le Wi-Fi ou débrancher le câble réseau.</w:t>
+        <w:t xml:space="preserve">Données : aucune.</w:t>
       </w:r>
     </w:p>
     <w:p>
@@ -14600,7 +15422,7 @@
           <w:sz w:val="20"/>
           <w:szCs w:val="20"/>
         </w:rPr>
-        <w:t xml:space="preserve">Ouvrez la page « Connexion » et saisissez l'identifiant et le mot de passe.</w:t>
+        <w:t xml:space="preserve">test.salarie : ouvrez l'adresse de la recette suivie de /rh et connectez-vous. Regardez la barre du haut de « Mon espace ».</w:t>
       </w:r>
     </w:p>
     <w:p>
@@ -14629,36 +15451,7 @@
           <w:sz w:val="20"/>
           <w:szCs w:val="20"/>
         </w:rPr>
-        <w:t xml:space="preserve">Coupez le réseau du poste, puis cliquez sur « Se connecter ».</w:t>
-      </w:r>
-    </w:p>
-    <w:p>
-      <w:pPr>
-        <w:tabs>
-          <w:tab w:val="left" w:pos="360"/>
-        </w:tabs>
-        <w:spacing w:after="60"/>
-        <w:ind w:left="360" w:hanging="360"/>
-        <w:jc w:val="both"/>
-      </w:pPr>
-      <w:r>
-        <w:rPr>
-          <w:rFonts w:ascii="Calibri" w:cs="Calibri" w:eastAsia="Calibri" w:hAnsi="Calibri"/>
-          <w:b/>
-          <w:bCs/>
-          <w:color w:val="1A9E9E"/>
-          <w:sz w:val="20"/>
-          <w:szCs w:val="20"/>
-        </w:rPr>
-        <w:t xml:space="preserve">3.	</w:t>
-      </w:r>
-      <w:r>
-        <w:rPr>
-          <w:rFonts w:ascii="Calibri" w:cs="Calibri" w:eastAsia="Calibri" w:hAnsi="Calibri"/>
-          <w:sz w:val="20"/>
-          <w:szCs w:val="20"/>
-        </w:rPr>
-        <w:t xml:space="preserve">Rétablissez le réseau et cliquez de nouveau sur « Se connecter ».</w:t>
+        <w:t xml:space="preserve">test.porteur : ouvrez l'adresse de la recette suivie de /portail et connectez-vous. Ouvrez le menu de votre compte.</w:t>
       </w:r>
     </w:p>
     <w:p>
@@ -14672,7 +15465,7 @@
           <w:sz w:val="20"/>
           <w:szCs w:val="20"/>
         </w:rPr>
-        <w:t xml:space="preserve">Résultat attendu : à l'étape 2, le message « Réseau indisponible : vérifiez la connexion puis réessayez. » s'affiche ; aucun message en anglais ni code. Le bouton redevient cliquable. À l'étape 3, la connexion aboutit.</w:t>
+        <w:t xml:space="preserve">Résultat attendu : test.salarie ne voit pas l'icône de discussion. test.porteur ne voit ni l'icône de discussion ni « Mes demandes » : il écrit au cabinet par « Messages » du portail.</w:t>
       </w:r>
     </w:p>
     <w:tbl>
@@ -14889,6 +15682,26 @@
     <w:p>
       <w:pPr>
         <w:keepNext/>
+        <w:pBdr>
+          <w:bottom w:val="single" w:color="1A9E9E" w:sz="6" w:space="2"/>
+        </w:pBdr>
+        <w:spacing w:after="100" w:before="280"/>
+      </w:pPr>
+      <w:r>
+        <w:rPr>
+          <w:rFonts w:ascii="Calibri" w:cs="Calibri" w:eastAsia="Calibri" w:hAnsi="Calibri"/>
+          <w:b/>
+          <w:bCs/>
+          <w:color w:val="1C1E6B"/>
+          <w:sz w:val="26"/>
+          <w:szCs w:val="26"/>
+        </w:rPr>
+        <w:t xml:space="preserve">H. Contrôles de saisie et de sécurité</w:t>
+      </w:r>
+    </w:p>
+    <w:p>
+      <w:pPr>
+        <w:keepNext/>
         <w:spacing w:after="100" w:before="200"/>
       </w:pPr>
       <w:r>
@@ -14900,7 +15713,7 @@
           <w:sz w:val="22"/>
           <w:szCs w:val="22"/>
         </w:rPr>
-        <w:t xml:space="preserve">SOC-33. Un double clic ne dépose qu'une demande</w:t>
+        <w:t xml:space="preserve">SOC-33. Message clair en cas de coupure du réseau</w:t>
       </w:r>
     </w:p>
     <w:p>
@@ -14914,7 +15727,7 @@
           <w:sz w:val="20"/>
           <w:szCs w:val="20"/>
         </w:rPr>
-        <w:t xml:space="preserve">Objectif : vérifier qu'un double clic sur un bouton d'enregistrement n'enregistre qu'une fois.</w:t>
+        <w:t xml:space="preserve">Objectif : vérifier qu'une coupure du réseau est annoncée par un message en français.</w:t>
       </w:r>
     </w:p>
     <w:p>
@@ -14942,7 +15755,7 @@
           <w:sz w:val="20"/>
           <w:szCs w:val="20"/>
         </w:rPr>
-        <w:t xml:space="preserve">Données : type « Question » ; titre « SOC-33 : double clic » ; description « Essai du double clic. ».</w:t>
+        <w:t xml:space="preserve">Données : un poste dont on peut couper le Wi-Fi ou débrancher le câble réseau.</w:t>
       </w:r>
     </w:p>
     <w:p>
@@ -14971,7 +15784,7 @@
           <w:sz w:val="20"/>
           <w:szCs w:val="20"/>
         </w:rPr>
-        <w:t xml:space="preserve">« Mes demandes » &gt; « Nouvelle demande ». Remplissez la demande.</w:t>
+        <w:t xml:space="preserve">Ouvrez la page « Connexion » et saisissez l'identifiant et le mot de passe.</w:t>
       </w:r>
     </w:p>
     <w:p>
@@ -15000,7 +15813,7 @@
           <w:sz w:val="20"/>
           <w:szCs w:val="20"/>
         </w:rPr>
-        <w:t xml:space="preserve">Double-cliquez rapidement sur « Déposer la demande ».</w:t>
+        <w:t xml:space="preserve">Coupez le réseau du poste, puis cliquez sur « Se connecter ».</w:t>
       </w:r>
     </w:p>
     <w:p>
@@ -15029,6 +15842,377 @@
           <w:sz w:val="20"/>
           <w:szCs w:val="20"/>
         </w:rPr>
+        <w:t xml:space="preserve">Rétablissez le réseau et cliquez de nouveau sur « Se connecter ».</w:t>
+      </w:r>
+    </w:p>
+    <w:p>
+      <w:pPr>
+        <w:spacing w:after="100"/>
+        <w:jc w:val="both"/>
+      </w:pPr>
+      <w:r>
+        <w:rPr>
+          <w:rFonts w:ascii="Calibri" w:cs="Calibri" w:eastAsia="Calibri" w:hAnsi="Calibri"/>
+          <w:sz w:val="20"/>
+          <w:szCs w:val="20"/>
+        </w:rPr>
+        <w:t xml:space="preserve">Résultat attendu : à l'étape 2, le message « Réseau indisponible : vérifiez la connexion puis réessayez. » s'affiche ; aucun message en anglais ni code. Le bouton redevient cliquable. À l'étape 3, la connexion aboutit.</w:t>
+      </w:r>
+    </w:p>
+    <w:tbl>
+      <w:tblPr>
+        <w:tblW w:type="dxa" w:w="9638"/>
+        <w:tblBorders>
+          <w:top w:val="single" w:color="auto" w:sz="4"/>
+          <w:left w:val="single" w:color="auto" w:sz="4"/>
+          <w:bottom w:val="single" w:color="auto" w:sz="4"/>
+          <w:right w:val="single" w:color="auto" w:sz="4"/>
+          <w:insideH w:val="single" w:color="auto" w:sz="4"/>
+          <w:insideV w:val="single" w:color="auto" w:sz="4"/>
+        </w:tblBorders>
+      </w:tblPr>
+      <w:tblGrid>
+        <w:gridCol w:w="2586"/>
+        <w:gridCol w:w="7052"/>
+      </w:tblGrid>
+      <w:tr>
+        <w:trPr>
+          <w:tblHeader/>
+        </w:trPr>
+        <w:tc>
+          <w:tcPr>
+            <w:tcW w:type="dxa" w:w="2586"/>
+            <w:tcBorders>
+              <w:top w:val="single" w:color="C9CFD8" w:sz="4"/>
+              <w:left w:val="single" w:color="C9CFD8" w:sz="4"/>
+              <w:bottom w:val="single" w:color="C9CFD8" w:sz="4"/>
+              <w:right w:val="single" w:color="C9CFD8" w:sz="4"/>
+            </w:tcBorders>
+            <w:shd w:fill="1C1E6B" w:color="auto" w:val="clear"/>
+            <w:tcMar>
+              <w:top w:type="dxa" w:w="50"/>
+              <w:left w:type="dxa" w:w="90"/>
+              <w:bottom w:type="dxa" w:w="50"/>
+              <w:right w:type="dxa" w:w="90"/>
+            </w:tcMar>
+            <w:vAlign w:val="center"/>
+          </w:tcPr>
+          <w:p>
+            <w:pPr>
+              <w:spacing w:after="0"/>
+            </w:pPr>
+            <w:r>
+              <w:rPr>
+                <w:rFonts w:ascii="Calibri" w:cs="Calibri" w:eastAsia="Calibri" w:hAnsi="Calibri"/>
+                <w:b/>
+                <w:bCs/>
+                <w:color w:val="FFFFFF"/>
+                <w:sz w:val="17"/>
+                <w:szCs w:val="17"/>
+              </w:rPr>
+              <w:t xml:space="preserve">Résultat</w:t>
+            </w:r>
+          </w:p>
+        </w:tc>
+        <w:tc>
+          <w:tcPr>
+            <w:tcW w:type="dxa" w:w="7052"/>
+            <w:tcBorders>
+              <w:top w:val="single" w:color="C9CFD8" w:sz="4"/>
+              <w:left w:val="single" w:color="C9CFD8" w:sz="4"/>
+              <w:bottom w:val="single" w:color="C9CFD8" w:sz="4"/>
+              <w:right w:val="single" w:color="C9CFD8" w:sz="4"/>
+            </w:tcBorders>
+            <w:shd w:fill="1C1E6B" w:color="auto" w:val="clear"/>
+            <w:tcMar>
+              <w:top w:type="dxa" w:w="50"/>
+              <w:left w:type="dxa" w:w="90"/>
+              <w:bottom w:type="dxa" w:w="50"/>
+              <w:right w:type="dxa" w:w="90"/>
+            </w:tcMar>
+            <w:vAlign w:val="center"/>
+          </w:tcPr>
+          <w:p>
+            <w:pPr>
+              <w:spacing w:after="0"/>
+            </w:pPr>
+            <w:r>
+              <w:rPr>
+                <w:rFonts w:ascii="Calibri" w:cs="Calibri" w:eastAsia="Calibri" w:hAnsi="Calibri"/>
+                <w:b/>
+                <w:bCs/>
+                <w:color w:val="FFFFFF"/>
+                <w:sz w:val="17"/>
+                <w:szCs w:val="17"/>
+              </w:rPr>
+              <w:t xml:space="preserve">Remarques</w:t>
+            </w:r>
+          </w:p>
+        </w:tc>
+      </w:tr>
+      <w:tr>
+        <w:tc>
+          <w:tcPr>
+            <w:tcW w:type="dxa" w:w="2586"/>
+            <w:tcBorders>
+              <w:top w:val="single" w:color="C9CFD8" w:sz="4"/>
+              <w:left w:val="single" w:color="C9CFD8" w:sz="4"/>
+              <w:bottom w:val="single" w:color="C9CFD8" w:sz="4"/>
+              <w:right w:val="single" w:color="C9CFD8" w:sz="4"/>
+            </w:tcBorders>
+            <w:tcMar>
+              <w:top w:type="dxa" w:w="50"/>
+              <w:left w:type="dxa" w:w="90"/>
+              <w:bottom w:type="dxa" w:w="50"/>
+              <w:right w:type="dxa" w:w="90"/>
+            </w:tcMar>
+            <w:vAlign w:val="center"/>
+          </w:tcPr>
+          <w:p>
+            <w:pPr>
+              <w:spacing w:after="0"/>
+            </w:pPr>
+            <w:r>
+              <w:rPr>
+                <w:rFonts w:ascii="Calibri" w:cs="Calibri" w:eastAsia="Calibri" w:hAnsi="Calibri"/>
+                <w:sz w:val="17"/>
+                <w:szCs w:val="17"/>
+              </w:rPr>
+              <w:t xml:space="preserve">☐ Réussi</w:t>
+            </w:r>
+          </w:p>
+        </w:tc>
+        <w:tc>
+          <w:tcPr>
+            <w:tcW w:type="dxa" w:w="7052"/>
+            <w:tcBorders>
+              <w:top w:val="single" w:color="C9CFD8" w:sz="4"/>
+              <w:left w:val="single" w:color="C9CFD8" w:sz="4"/>
+              <w:bottom w:val="single" w:color="C9CFD8" w:sz="4"/>
+              <w:right w:val="single" w:color="C9CFD8" w:sz="4"/>
+            </w:tcBorders>
+            <w:tcMar>
+              <w:top w:type="dxa" w:w="50"/>
+              <w:left w:type="dxa" w:w="90"/>
+              <w:bottom w:type="dxa" w:w="50"/>
+              <w:right w:type="dxa" w:w="90"/>
+            </w:tcMar>
+            <w:vAlign w:val="center"/>
+          </w:tcPr>
+          <w:p>
+            <w:pPr>
+              <w:spacing w:after="0"/>
+            </w:pPr>
+          </w:p>
+        </w:tc>
+      </w:tr>
+      <w:tr>
+        <w:tc>
+          <w:tcPr>
+            <w:tcW w:type="dxa" w:w="2586"/>
+            <w:tcBorders>
+              <w:top w:val="single" w:color="C9CFD8" w:sz="4"/>
+              <w:left w:val="single" w:color="C9CFD8" w:sz="4"/>
+              <w:bottom w:val="single" w:color="C9CFD8" w:sz="4"/>
+              <w:right w:val="single" w:color="C9CFD8" w:sz="4"/>
+            </w:tcBorders>
+            <w:shd w:fill="F2F4F7" w:color="auto" w:val="clear"/>
+            <w:tcMar>
+              <w:top w:type="dxa" w:w="50"/>
+              <w:left w:type="dxa" w:w="90"/>
+              <w:bottom w:type="dxa" w:w="50"/>
+              <w:right w:type="dxa" w:w="90"/>
+            </w:tcMar>
+            <w:vAlign w:val="center"/>
+          </w:tcPr>
+          <w:p>
+            <w:pPr>
+              <w:spacing w:after="0"/>
+            </w:pPr>
+            <w:r>
+              <w:rPr>
+                <w:rFonts w:ascii="Calibri" w:cs="Calibri" w:eastAsia="Calibri" w:hAnsi="Calibri"/>
+                <w:sz w:val="17"/>
+                <w:szCs w:val="17"/>
+              </w:rPr>
+              <w:t xml:space="preserve">☐ Échoué</w:t>
+            </w:r>
+          </w:p>
+        </w:tc>
+        <w:tc>
+          <w:tcPr>
+            <w:tcW w:type="dxa" w:w="7052"/>
+            <w:tcBorders>
+              <w:top w:val="single" w:color="C9CFD8" w:sz="4"/>
+              <w:left w:val="single" w:color="C9CFD8" w:sz="4"/>
+              <w:bottom w:val="single" w:color="C9CFD8" w:sz="4"/>
+              <w:right w:val="single" w:color="C9CFD8" w:sz="4"/>
+            </w:tcBorders>
+            <w:shd w:fill="F2F4F7" w:color="auto" w:val="clear"/>
+            <w:tcMar>
+              <w:top w:type="dxa" w:w="50"/>
+              <w:left w:type="dxa" w:w="90"/>
+              <w:bottom w:type="dxa" w:w="50"/>
+              <w:right w:type="dxa" w:w="90"/>
+            </w:tcMar>
+            <w:vAlign w:val="center"/>
+          </w:tcPr>
+          <w:p>
+            <w:pPr>
+              <w:spacing w:after="0"/>
+            </w:pPr>
+          </w:p>
+        </w:tc>
+      </w:tr>
+    </w:tbl>
+    <w:p>
+      <w:pPr>
+        <w:spacing w:after="80"/>
+      </w:pPr>
+    </w:p>
+    <w:p>
+      <w:pPr>
+        <w:keepNext/>
+        <w:spacing w:after="100" w:before="200"/>
+      </w:pPr>
+      <w:r>
+        <w:rPr>
+          <w:rFonts w:ascii="Calibri" w:cs="Calibri" w:eastAsia="Calibri" w:hAnsi="Calibri"/>
+          <w:b/>
+          <w:bCs/>
+          <w:color w:val="1A9E9E"/>
+          <w:sz w:val="22"/>
+          <w:szCs w:val="22"/>
+        </w:rPr>
+        <w:t xml:space="preserve">SOC-34. Un double clic ne dépose qu'une demande</w:t>
+      </w:r>
+    </w:p>
+    <w:p>
+      <w:pPr>
+        <w:spacing w:after="100"/>
+        <w:jc w:val="both"/>
+      </w:pPr>
+      <w:r>
+        <w:rPr>
+          <w:rFonts w:ascii="Calibri" w:cs="Calibri" w:eastAsia="Calibri" w:hAnsi="Calibri"/>
+          <w:sz w:val="20"/>
+          <w:szCs w:val="20"/>
+        </w:rPr>
+        <w:t xml:space="preserve">Objectif : vérifier qu'un double clic sur un bouton d'enregistrement n'enregistre qu'une fois.</w:t>
+      </w:r>
+    </w:p>
+    <w:p>
+      <w:pPr>
+        <w:spacing w:after="100"/>
+        <w:jc w:val="both"/>
+      </w:pPr>
+      <w:r>
+        <w:rPr>
+          <w:rFonts w:ascii="Calibri" w:cs="Calibri" w:eastAsia="Calibri" w:hAnsi="Calibri"/>
+          <w:sz w:val="20"/>
+          <w:szCs w:val="20"/>
+        </w:rPr>
+        <w:t xml:space="preserve">Compte : test.comptable.</w:t>
+      </w:r>
+    </w:p>
+    <w:p>
+      <w:pPr>
+        <w:spacing w:after="100"/>
+        <w:jc w:val="both"/>
+      </w:pPr>
+      <w:r>
+        <w:rPr>
+          <w:rFonts w:ascii="Calibri" w:cs="Calibri" w:eastAsia="Calibri" w:hAnsi="Calibri"/>
+          <w:sz w:val="20"/>
+          <w:szCs w:val="20"/>
+        </w:rPr>
+        <w:t xml:space="preserve">Données : type « Question » ; titre « SOC-34 : double clic » ; description « Essai du double clic. ».</w:t>
+      </w:r>
+    </w:p>
+    <w:p>
+      <w:pPr>
+        <w:tabs>
+          <w:tab w:val="left" w:pos="360"/>
+        </w:tabs>
+        <w:spacing w:after="60"/>
+        <w:ind w:left="360" w:hanging="360"/>
+        <w:jc w:val="both"/>
+      </w:pPr>
+      <w:r>
+        <w:rPr>
+          <w:rFonts w:ascii="Calibri" w:cs="Calibri" w:eastAsia="Calibri" w:hAnsi="Calibri"/>
+          <w:b/>
+          <w:bCs/>
+          <w:color w:val="1A9E9E"/>
+          <w:sz w:val="20"/>
+          <w:szCs w:val="20"/>
+        </w:rPr>
+        <w:t xml:space="preserve">1.	</w:t>
+      </w:r>
+      <w:r>
+        <w:rPr>
+          <w:rFonts w:ascii="Calibri" w:cs="Calibri" w:eastAsia="Calibri" w:hAnsi="Calibri"/>
+          <w:sz w:val="20"/>
+          <w:szCs w:val="20"/>
+        </w:rPr>
+        <w:t xml:space="preserve">« Mes demandes » &gt; « Nouvelle demande ». Remplissez la demande.</w:t>
+      </w:r>
+    </w:p>
+    <w:p>
+      <w:pPr>
+        <w:tabs>
+          <w:tab w:val="left" w:pos="360"/>
+        </w:tabs>
+        <w:spacing w:after="60"/>
+        <w:ind w:left="360" w:hanging="360"/>
+        <w:jc w:val="both"/>
+      </w:pPr>
+      <w:r>
+        <w:rPr>
+          <w:rFonts w:ascii="Calibri" w:cs="Calibri" w:eastAsia="Calibri" w:hAnsi="Calibri"/>
+          <w:b/>
+          <w:bCs/>
+          <w:color w:val="1A9E9E"/>
+          <w:sz w:val="20"/>
+          <w:szCs w:val="20"/>
+        </w:rPr>
+        <w:t xml:space="preserve">2.	</w:t>
+      </w:r>
+      <w:r>
+        <w:rPr>
+          <w:rFonts w:ascii="Calibri" w:cs="Calibri" w:eastAsia="Calibri" w:hAnsi="Calibri"/>
+          <w:sz w:val="20"/>
+          <w:szCs w:val="20"/>
+        </w:rPr>
+        <w:t xml:space="preserve">Double-cliquez rapidement sur « Déposer la demande ».</w:t>
+      </w:r>
+    </w:p>
+    <w:p>
+      <w:pPr>
+        <w:tabs>
+          <w:tab w:val="left" w:pos="360"/>
+        </w:tabs>
+        <w:spacing w:after="60"/>
+        <w:ind w:left="360" w:hanging="360"/>
+        <w:jc w:val="both"/>
+      </w:pPr>
+      <w:r>
+        <w:rPr>
+          <w:rFonts w:ascii="Calibri" w:cs="Calibri" w:eastAsia="Calibri" w:hAnsi="Calibri"/>
+          <w:b/>
+          <w:bCs/>
+          <w:color w:val="1A9E9E"/>
+          <w:sz w:val="20"/>
+          <w:szCs w:val="20"/>
+        </w:rPr>
+        <w:t xml:space="preserve">3.	</w:t>
+      </w:r>
+      <w:r>
+        <w:rPr>
+          <w:rFonts w:ascii="Calibri" w:cs="Calibri" w:eastAsia="Calibri" w:hAnsi="Calibri"/>
+          <w:sz w:val="20"/>
+          <w:szCs w:val="20"/>
+        </w:rPr>
         <w:t xml:space="preserve">Revenez à la liste « Mes demandes ».</w:t>
       </w:r>
     </w:p>
@@ -15043,7 +16227,7 @@
           <w:sz w:val="20"/>
           <w:szCs w:val="20"/>
         </w:rPr>
-        <w:t xml:space="preserve">Résultat attendu : le bouton tourne pendant l'envoi ; une seule demande « SOC-33 : double clic » figure dans la liste.</w:t>
+        <w:t xml:space="preserve">Résultat attendu : le bouton tourne pendant l'envoi ; une seule demande « SOC-34 : double clic » figure dans la liste.</w:t>
       </w:r>
     </w:p>
     <w:tbl>
@@ -16212,7 +17396,7 @@
                 <w:sz w:val="17"/>
                 <w:szCs w:val="17"/>
               </w:rPr>
-              <w:t xml:space="preserve">6</w:t>
+              <w:t xml:space="preserve">7</w:t>
             </w:r>
           </w:p>
         </w:tc>
@@ -16619,7 +17803,7 @@
                 <w:sz w:val="17"/>
                 <w:szCs w:val="17"/>
               </w:rPr>
-              <w:t xml:space="preserve">33</w:t>
+              <w:t xml:space="preserve">34</w:t>
             </w:r>
           </w:p>
         </w:tc>

</xml_diff>